<commit_message>
Finalise submission: team, video, repo link and Web IQ reason
Fills the remaining form fields and removes placeholders from the solution
document. Web IQ status now cites the Frontier Preview Program enrollment
requirement from the hackathon prerequisites.

Co-Authored-By: Claude Opus 5.5 <noreply@anthropic.com>
</commit_message>
<xml_diff>
--- a/submission/Strategic_Warehouse_Location_Planner.docx
+++ b/submission/Strategic_Warehouse_Location_Planner.docx
@@ -802,7 +802,7 @@
                 <w:lang w:eastAsia="en-IN"/>
                 <w14:ligatures w14:val="none"/>
               </w:rPr>
-              <w:t>Draft. Technical and business review pending</w:t>
+              <w:t>Final for submission</w:t>
             </w:r>
           </w:p>
         </w:tc>
@@ -1066,7 +1066,7 @@
         </w:rPr>
         <w:fldChar w:fldCharType="separate"/>
       </w:r>
-      <w:hyperlink w:anchor="_Toc241847829" w:history="1">
+      <w:hyperlink w:anchor="_Toc241861127" w:history="1">
         <w:r>
           <w:rPr>
             <w:rStyle w:val="Hyperlink"/>
@@ -1090,7 +1090,7 @@
           <w:rPr>
             <w:noProof/>
           </w:rPr>
-          <w:instrText xml:space="preserve"> PAGEREF _Toc241847829 \h </w:instrText>
+          <w:instrText xml:space="preserve"> PAGEREF _Toc241861127 \h </w:instrText>
         </w:r>
         <w:r>
           <w:rPr>
@@ -1129,7 +1129,7 @@
           <w:lang w:val="en-CA"/>
         </w:rPr>
       </w:pPr>
-      <w:hyperlink w:anchor="_Toc241847830" w:history="1">
+      <w:hyperlink w:anchor="_Toc241861128" w:history="1">
         <w:r>
           <w:rPr>
             <w:rStyle w:val="Hyperlink"/>
@@ -1153,7 +1153,7 @@
           <w:rPr>
             <w:noProof/>
           </w:rPr>
-          <w:instrText xml:space="preserve"> PAGEREF _Toc241847830 \h </w:instrText>
+          <w:instrText xml:space="preserve"> PAGEREF _Toc241861128 \h </w:instrText>
         </w:r>
         <w:r>
           <w:rPr>
@@ -1192,7 +1192,7 @@
           <w:lang w:val="en-CA"/>
         </w:rPr>
       </w:pPr>
-      <w:hyperlink w:anchor="_Toc241847831" w:history="1">
+      <w:hyperlink w:anchor="_Toc241861129" w:history="1">
         <w:r>
           <w:rPr>
             <w:rStyle w:val="Hyperlink"/>
@@ -1216,7 +1216,7 @@
           <w:rPr>
             <w:noProof/>
           </w:rPr>
-          <w:instrText xml:space="preserve"> PAGEREF _Toc241847831 \h </w:instrText>
+          <w:instrText xml:space="preserve"> PAGEREF _Toc241861129 \h </w:instrText>
         </w:r>
         <w:r>
           <w:rPr>
@@ -1255,7 +1255,7 @@
           <w:lang w:val="en-CA"/>
         </w:rPr>
       </w:pPr>
-      <w:hyperlink w:anchor="_Toc241847832" w:history="1">
+      <w:hyperlink w:anchor="_Toc241861130" w:history="1">
         <w:r>
           <w:rPr>
             <w:rStyle w:val="Hyperlink"/>
@@ -1279,7 +1279,7 @@
           <w:rPr>
             <w:noProof/>
           </w:rPr>
-          <w:instrText xml:space="preserve"> PAGEREF _Toc241847832 \h </w:instrText>
+          <w:instrText xml:space="preserve"> PAGEREF _Toc241861130 \h </w:instrText>
         </w:r>
         <w:r>
           <w:rPr>
@@ -1318,7 +1318,7 @@
           <w:lang w:val="en-CA"/>
         </w:rPr>
       </w:pPr>
-      <w:hyperlink w:anchor="_Toc241847833" w:history="1">
+      <w:hyperlink w:anchor="_Toc241861131" w:history="1">
         <w:r>
           <w:rPr>
             <w:rStyle w:val="Hyperlink"/>
@@ -1342,7 +1342,7 @@
           <w:rPr>
             <w:noProof/>
           </w:rPr>
-          <w:instrText xml:space="preserve"> PAGEREF _Toc241847833 \h </w:instrText>
+          <w:instrText xml:space="preserve"> PAGEREF _Toc241861131 \h </w:instrText>
         </w:r>
         <w:r>
           <w:rPr>
@@ -1381,7 +1381,7 @@
           <w:lang w:val="en-CA"/>
         </w:rPr>
       </w:pPr>
-      <w:hyperlink w:anchor="_Toc241847834" w:history="1">
+      <w:hyperlink w:anchor="_Toc241861132" w:history="1">
         <w:r>
           <w:rPr>
             <w:rStyle w:val="Hyperlink"/>
@@ -1405,7 +1405,7 @@
           <w:rPr>
             <w:noProof/>
           </w:rPr>
-          <w:instrText xml:space="preserve"> PAGEREF _Toc241847834 \h </w:instrText>
+          <w:instrText xml:space="preserve"> PAGEREF _Toc241861132 \h </w:instrText>
         </w:r>
         <w:r>
           <w:rPr>
@@ -1444,7 +1444,7 @@
           <w:lang w:val="en-CA"/>
         </w:rPr>
       </w:pPr>
-      <w:hyperlink w:anchor="_Toc241847835" w:history="1">
+      <w:hyperlink w:anchor="_Toc241861133" w:history="1">
         <w:r>
           <w:rPr>
             <w:rStyle w:val="Hyperlink"/>
@@ -1468,7 +1468,7 @@
           <w:rPr>
             <w:noProof/>
           </w:rPr>
-          <w:instrText xml:space="preserve"> PAGEREF _Toc241847835 \h </w:instrText>
+          <w:instrText xml:space="preserve"> PAGEREF _Toc241861133 \h </w:instrText>
         </w:r>
         <w:r>
           <w:rPr>
@@ -1507,7 +1507,7 @@
           <w:lang w:val="en-CA"/>
         </w:rPr>
       </w:pPr>
-      <w:hyperlink w:anchor="_Toc241847836" w:history="1">
+      <w:hyperlink w:anchor="_Toc241861134" w:history="1">
         <w:r>
           <w:rPr>
             <w:rStyle w:val="Hyperlink"/>
@@ -1531,7 +1531,7 @@
           <w:rPr>
             <w:noProof/>
           </w:rPr>
-          <w:instrText xml:space="preserve"> PAGEREF _Toc241847836 \h </w:instrText>
+          <w:instrText xml:space="preserve"> PAGEREF _Toc241861134 \h </w:instrText>
         </w:r>
         <w:r>
           <w:rPr>
@@ -1570,7 +1570,7 @@
           <w:lang w:val="en-CA"/>
         </w:rPr>
       </w:pPr>
-      <w:hyperlink w:anchor="_Toc241847837" w:history="1">
+      <w:hyperlink w:anchor="_Toc241861135" w:history="1">
         <w:r>
           <w:rPr>
             <w:rStyle w:val="Hyperlink"/>
@@ -1594,7 +1594,7 @@
           <w:rPr>
             <w:noProof/>
           </w:rPr>
-          <w:instrText xml:space="preserve"> PAGEREF _Toc241847837 \h </w:instrText>
+          <w:instrText xml:space="preserve"> PAGEREF _Toc241861135 \h </w:instrText>
         </w:r>
         <w:r>
           <w:rPr>
@@ -1633,7 +1633,7 @@
           <w:lang w:val="en-CA"/>
         </w:rPr>
       </w:pPr>
-      <w:hyperlink w:anchor="_Toc241847838" w:history="1">
+      <w:hyperlink w:anchor="_Toc241861136" w:history="1">
         <w:r>
           <w:rPr>
             <w:rStyle w:val="Hyperlink"/>
@@ -1657,7 +1657,7 @@
           <w:rPr>
             <w:noProof/>
           </w:rPr>
-          <w:instrText xml:space="preserve"> PAGEREF _Toc241847838 \h </w:instrText>
+          <w:instrText xml:space="preserve"> PAGEREF _Toc241861136 \h </w:instrText>
         </w:r>
         <w:r>
           <w:rPr>
@@ -1696,7 +1696,7 @@
           <w:lang w:val="en-CA"/>
         </w:rPr>
       </w:pPr>
-      <w:hyperlink w:anchor="_Toc241847839" w:history="1">
+      <w:hyperlink w:anchor="_Toc241861137" w:history="1">
         <w:r>
           <w:rPr>
             <w:rStyle w:val="Hyperlink"/>
@@ -1720,7 +1720,7 @@
           <w:rPr>
             <w:noProof/>
           </w:rPr>
-          <w:instrText xml:space="preserve"> PAGEREF _Toc241847839 \h </w:instrText>
+          <w:instrText xml:space="preserve"> PAGEREF _Toc241861137 \h </w:instrText>
         </w:r>
         <w:r>
           <w:rPr>
@@ -1759,7 +1759,7 @@
           <w:lang w:val="en-CA"/>
         </w:rPr>
       </w:pPr>
-      <w:hyperlink w:anchor="_Toc241847840" w:history="1">
+      <w:hyperlink w:anchor="_Toc241861138" w:history="1">
         <w:r>
           <w:rPr>
             <w:rStyle w:val="Hyperlink"/>
@@ -1783,7 +1783,7 @@
           <w:rPr>
             <w:noProof/>
           </w:rPr>
-          <w:instrText xml:space="preserve"> PAGEREF _Toc241847840 \h </w:instrText>
+          <w:instrText xml:space="preserve"> PAGEREF _Toc241861138 \h </w:instrText>
         </w:r>
         <w:r>
           <w:rPr>
@@ -1822,7 +1822,7 @@
           <w:lang w:val="en-CA"/>
         </w:rPr>
       </w:pPr>
-      <w:hyperlink w:anchor="_Toc241847841" w:history="1">
+      <w:hyperlink w:anchor="_Toc241861139" w:history="1">
         <w:r>
           <w:rPr>
             <w:rStyle w:val="Hyperlink"/>
@@ -1846,7 +1846,7 @@
           <w:rPr>
             <w:noProof/>
           </w:rPr>
-          <w:instrText xml:space="preserve"> PAGEREF _Toc241847841 \h </w:instrText>
+          <w:instrText xml:space="preserve"> PAGEREF _Toc241861139 \h </w:instrText>
         </w:r>
         <w:r>
           <w:rPr>
@@ -1885,7 +1885,7 @@
           <w:lang w:val="en-CA"/>
         </w:rPr>
       </w:pPr>
-      <w:hyperlink w:anchor="_Toc241847842" w:history="1">
+      <w:hyperlink w:anchor="_Toc241861140" w:history="1">
         <w:r>
           <w:rPr>
             <w:rStyle w:val="Hyperlink"/>
@@ -1909,7 +1909,7 @@
           <w:rPr>
             <w:noProof/>
           </w:rPr>
-          <w:instrText xml:space="preserve"> PAGEREF _Toc241847842 \h </w:instrText>
+          <w:instrText xml:space="preserve"> PAGEREF _Toc241861140 \h </w:instrText>
         </w:r>
         <w:r>
           <w:rPr>
@@ -1948,7 +1948,7 @@
           <w:lang w:val="en-CA"/>
         </w:rPr>
       </w:pPr>
-      <w:hyperlink w:anchor="_Toc241847843" w:history="1">
+      <w:hyperlink w:anchor="_Toc241861141" w:history="1">
         <w:r>
           <w:rPr>
             <w:rStyle w:val="Hyperlink"/>
@@ -1972,7 +1972,7 @@
           <w:rPr>
             <w:noProof/>
           </w:rPr>
-          <w:instrText xml:space="preserve"> PAGEREF _Toc241847843 \h </w:instrText>
+          <w:instrText xml:space="preserve"> PAGEREF _Toc241861141 \h </w:instrText>
         </w:r>
         <w:r>
           <w:rPr>
@@ -2011,7 +2011,7 @@
           <w:lang w:val="en-CA"/>
         </w:rPr>
       </w:pPr>
-      <w:hyperlink w:anchor="_Toc241847844" w:history="1">
+      <w:hyperlink w:anchor="_Toc241861142" w:history="1">
         <w:r>
           <w:rPr>
             <w:rStyle w:val="Hyperlink"/>
@@ -2035,7 +2035,7 @@
           <w:rPr>
             <w:noProof/>
           </w:rPr>
-          <w:instrText xml:space="preserve"> PAGEREF _Toc241847844 \h </w:instrText>
+          <w:instrText xml:space="preserve"> PAGEREF _Toc241861142 \h </w:instrText>
         </w:r>
         <w:r>
           <w:rPr>
@@ -2074,7 +2074,7 @@
           <w:lang w:val="en-CA"/>
         </w:rPr>
       </w:pPr>
-      <w:hyperlink w:anchor="_Toc241847845" w:history="1">
+      <w:hyperlink w:anchor="_Toc241861143" w:history="1">
         <w:r>
           <w:rPr>
             <w:rStyle w:val="Hyperlink"/>
@@ -2098,7 +2098,7 @@
           <w:rPr>
             <w:noProof/>
           </w:rPr>
-          <w:instrText xml:space="preserve"> PAGEREF _Toc241847845 \h </w:instrText>
+          <w:instrText xml:space="preserve"> PAGEREF _Toc241861143 \h </w:instrText>
         </w:r>
         <w:r>
           <w:rPr>
@@ -2137,7 +2137,7 @@
           <w:lang w:val="en-CA"/>
         </w:rPr>
       </w:pPr>
-      <w:hyperlink w:anchor="_Toc241847846" w:history="1">
+      <w:hyperlink w:anchor="_Toc241861144" w:history="1">
         <w:r>
           <w:rPr>
             <w:rStyle w:val="Hyperlink"/>
@@ -2161,7 +2161,7 @@
           <w:rPr>
             <w:noProof/>
           </w:rPr>
-          <w:instrText xml:space="preserve"> PAGEREF _Toc241847846 \h </w:instrText>
+          <w:instrText xml:space="preserve"> PAGEREF _Toc241861144 \h </w:instrText>
         </w:r>
         <w:r>
           <w:rPr>
@@ -2200,7 +2200,7 @@
           <w:lang w:val="en-CA"/>
         </w:rPr>
       </w:pPr>
-      <w:hyperlink w:anchor="_Toc241847847" w:history="1">
+      <w:hyperlink w:anchor="_Toc241861145" w:history="1">
         <w:r>
           <w:rPr>
             <w:rStyle w:val="Hyperlink"/>
@@ -2224,7 +2224,7 @@
           <w:rPr>
             <w:noProof/>
           </w:rPr>
-          <w:instrText xml:space="preserve"> PAGEREF _Toc241847847 \h </w:instrText>
+          <w:instrText xml:space="preserve"> PAGEREF _Toc241861145 \h </w:instrText>
         </w:r>
         <w:r>
           <w:rPr>
@@ -2263,7 +2263,7 @@
           <w:lang w:val="en-CA"/>
         </w:rPr>
       </w:pPr>
-      <w:hyperlink w:anchor="_Toc241847848" w:history="1">
+      <w:hyperlink w:anchor="_Toc241861146" w:history="1">
         <w:r>
           <w:rPr>
             <w:rStyle w:val="Hyperlink"/>
@@ -2287,7 +2287,7 @@
           <w:rPr>
             <w:noProof/>
           </w:rPr>
-          <w:instrText xml:space="preserve"> PAGEREF _Toc241847848 \h </w:instrText>
+          <w:instrText xml:space="preserve"> PAGEREF _Toc241861146 \h </w:instrText>
         </w:r>
         <w:r>
           <w:rPr>
@@ -2326,7 +2326,7 @@
           <w:lang w:val="en-CA"/>
         </w:rPr>
       </w:pPr>
-      <w:hyperlink w:anchor="_Toc241847849" w:history="1">
+      <w:hyperlink w:anchor="_Toc241861147" w:history="1">
         <w:r>
           <w:rPr>
             <w:rStyle w:val="Hyperlink"/>
@@ -2350,7 +2350,7 @@
           <w:rPr>
             <w:noProof/>
           </w:rPr>
-          <w:instrText xml:space="preserve"> PAGEREF _Toc241847849 \h </w:instrText>
+          <w:instrText xml:space="preserve"> PAGEREF _Toc241861147 \h </w:instrText>
         </w:r>
         <w:r>
           <w:rPr>
@@ -2389,7 +2389,7 @@
           <w:lang w:val="en-CA"/>
         </w:rPr>
       </w:pPr>
-      <w:hyperlink w:anchor="_Toc241847850" w:history="1">
+      <w:hyperlink w:anchor="_Toc241861148" w:history="1">
         <w:r>
           <w:rPr>
             <w:rStyle w:val="Hyperlink"/>
@@ -2413,7 +2413,7 @@
           <w:rPr>
             <w:noProof/>
           </w:rPr>
-          <w:instrText xml:space="preserve"> PAGEREF _Toc241847850 \h </w:instrText>
+          <w:instrText xml:space="preserve"> PAGEREF _Toc241861148 \h </w:instrText>
         </w:r>
         <w:r>
           <w:rPr>
@@ -2452,7 +2452,7 @@
           <w:lang w:val="en-CA"/>
         </w:rPr>
       </w:pPr>
-      <w:hyperlink w:anchor="_Toc241847851" w:history="1">
+      <w:hyperlink w:anchor="_Toc241861149" w:history="1">
         <w:r>
           <w:rPr>
             <w:rStyle w:val="Hyperlink"/>
@@ -2476,7 +2476,7 @@
           <w:rPr>
             <w:noProof/>
           </w:rPr>
-          <w:instrText xml:space="preserve"> PAGEREF _Toc241847851 \h </w:instrText>
+          <w:instrText xml:space="preserve"> PAGEREF _Toc241861149 \h </w:instrText>
         </w:r>
         <w:r>
           <w:rPr>
@@ -2515,7 +2515,7 @@
           <w:lang w:val="en-CA"/>
         </w:rPr>
       </w:pPr>
-      <w:hyperlink w:anchor="_Toc241847852" w:history="1">
+      <w:hyperlink w:anchor="_Toc241861150" w:history="1">
         <w:r>
           <w:rPr>
             <w:rStyle w:val="Hyperlink"/>
@@ -2539,7 +2539,7 @@
           <w:rPr>
             <w:noProof/>
           </w:rPr>
-          <w:instrText xml:space="preserve"> PAGEREF _Toc241847852 \h </w:instrText>
+          <w:instrText xml:space="preserve"> PAGEREF _Toc241861150 \h </w:instrText>
         </w:r>
         <w:r>
           <w:rPr>
@@ -2578,7 +2578,7 @@
           <w:lang w:val="en-CA"/>
         </w:rPr>
       </w:pPr>
-      <w:hyperlink w:anchor="_Toc241847853" w:history="1">
+      <w:hyperlink w:anchor="_Toc241861151" w:history="1">
         <w:r>
           <w:rPr>
             <w:rStyle w:val="Hyperlink"/>
@@ -2602,7 +2602,7 @@
           <w:rPr>
             <w:noProof/>
           </w:rPr>
-          <w:instrText xml:space="preserve"> PAGEREF _Toc241847853 \h </w:instrText>
+          <w:instrText xml:space="preserve"> PAGEREF _Toc241861151 \h </w:instrText>
         </w:r>
         <w:r>
           <w:rPr>
@@ -2641,7 +2641,7 @@
           <w:lang w:val="en-CA"/>
         </w:rPr>
       </w:pPr>
-      <w:hyperlink w:anchor="_Toc241847854" w:history="1">
+      <w:hyperlink w:anchor="_Toc241861152" w:history="1">
         <w:r>
           <w:rPr>
             <w:rStyle w:val="Hyperlink"/>
@@ -2665,7 +2665,7 @@
           <w:rPr>
             <w:noProof/>
           </w:rPr>
-          <w:instrText xml:space="preserve"> PAGEREF _Toc241847854 \h </w:instrText>
+          <w:instrText xml:space="preserve"> PAGEREF _Toc241861152 \h </w:instrText>
         </w:r>
         <w:r>
           <w:rPr>
@@ -2704,7 +2704,7 @@
           <w:lang w:val="en-CA"/>
         </w:rPr>
       </w:pPr>
-      <w:hyperlink w:anchor="_Toc241847855" w:history="1">
+      <w:hyperlink w:anchor="_Toc241861153" w:history="1">
         <w:r>
           <w:rPr>
             <w:rStyle w:val="Hyperlink"/>
@@ -2728,7 +2728,7 @@
           <w:rPr>
             <w:noProof/>
           </w:rPr>
-          <w:instrText xml:space="preserve"> PAGEREF _Toc241847855 \h </w:instrText>
+          <w:instrText xml:space="preserve"> PAGEREF _Toc241861153 \h </w:instrText>
         </w:r>
         <w:r>
           <w:rPr>
@@ -2767,7 +2767,7 @@
           <w:lang w:val="en-CA"/>
         </w:rPr>
       </w:pPr>
-      <w:hyperlink w:anchor="_Toc241847856" w:history="1">
+      <w:hyperlink w:anchor="_Toc241861154" w:history="1">
         <w:r>
           <w:rPr>
             <w:rStyle w:val="Hyperlink"/>
@@ -2791,7 +2791,7 @@
           <w:rPr>
             <w:noProof/>
           </w:rPr>
-          <w:instrText xml:space="preserve"> PAGEREF _Toc241847856 \h </w:instrText>
+          <w:instrText xml:space="preserve"> PAGEREF _Toc241861154 \h </w:instrText>
         </w:r>
         <w:r>
           <w:rPr>
@@ -2830,7 +2830,7 @@
           <w:lang w:val="en-CA"/>
         </w:rPr>
       </w:pPr>
-      <w:hyperlink w:anchor="_Toc241847857" w:history="1">
+      <w:hyperlink w:anchor="_Toc241861155" w:history="1">
         <w:r>
           <w:rPr>
             <w:rStyle w:val="Hyperlink"/>
@@ -2854,7 +2854,7 @@
           <w:rPr>
             <w:noProof/>
           </w:rPr>
-          <w:instrText xml:space="preserve"> PAGEREF _Toc241847857 \h </w:instrText>
+          <w:instrText xml:space="preserve"> PAGEREF _Toc241861155 \h </w:instrText>
         </w:r>
         <w:r>
           <w:rPr>
@@ -2893,7 +2893,7 @@
           <w:lang w:val="en-CA"/>
         </w:rPr>
       </w:pPr>
-      <w:hyperlink w:anchor="_Toc241847858" w:history="1">
+      <w:hyperlink w:anchor="_Toc241861156" w:history="1">
         <w:r>
           <w:rPr>
             <w:rStyle w:val="Hyperlink"/>
@@ -2917,7 +2917,7 @@
           <w:rPr>
             <w:noProof/>
           </w:rPr>
-          <w:instrText xml:space="preserve"> PAGEREF _Toc241847858 \h </w:instrText>
+          <w:instrText xml:space="preserve"> PAGEREF _Toc241861156 \h </w:instrText>
         </w:r>
         <w:r>
           <w:rPr>
@@ -2956,7 +2956,7 @@
           <w:lang w:val="en-CA"/>
         </w:rPr>
       </w:pPr>
-      <w:hyperlink w:anchor="_Toc241847859" w:history="1">
+      <w:hyperlink w:anchor="_Toc241861157" w:history="1">
         <w:r>
           <w:rPr>
             <w:rStyle w:val="Hyperlink"/>
@@ -2980,7 +2980,7 @@
           <w:rPr>
             <w:noProof/>
           </w:rPr>
-          <w:instrText xml:space="preserve"> PAGEREF _Toc241847859 \h </w:instrText>
+          <w:instrText xml:space="preserve"> PAGEREF _Toc241861157 \h </w:instrText>
         </w:r>
         <w:r>
           <w:rPr>
@@ -3019,7 +3019,7 @@
           <w:lang w:val="en-CA"/>
         </w:rPr>
       </w:pPr>
-      <w:hyperlink w:anchor="_Toc241847860" w:history="1">
+      <w:hyperlink w:anchor="_Toc241861158" w:history="1">
         <w:r>
           <w:rPr>
             <w:rStyle w:val="Hyperlink"/>
@@ -3043,7 +3043,7 @@
           <w:rPr>
             <w:noProof/>
           </w:rPr>
-          <w:instrText xml:space="preserve"> PAGEREF _Toc241847860 \h </w:instrText>
+          <w:instrText xml:space="preserve"> PAGEREF _Toc241861158 \h </w:instrText>
         </w:r>
         <w:r>
           <w:rPr>
@@ -3082,7 +3082,7 @@
           <w:lang w:val="en-CA"/>
         </w:rPr>
       </w:pPr>
-      <w:hyperlink w:anchor="_Toc241847861" w:history="1">
+      <w:hyperlink w:anchor="_Toc241861159" w:history="1">
         <w:r>
           <w:rPr>
             <w:rStyle w:val="Hyperlink"/>
@@ -3106,7 +3106,7 @@
           <w:rPr>
             <w:noProof/>
           </w:rPr>
-          <w:instrText xml:space="preserve"> PAGEREF _Toc241847861 \h </w:instrText>
+          <w:instrText xml:space="preserve"> PAGEREF _Toc241861159 \h </w:instrText>
         </w:r>
         <w:r>
           <w:rPr>
@@ -3145,7 +3145,7 @@
           <w:lang w:val="en-CA"/>
         </w:rPr>
       </w:pPr>
-      <w:hyperlink w:anchor="_Toc241847862" w:history="1">
+      <w:hyperlink w:anchor="_Toc241861160" w:history="1">
         <w:r>
           <w:rPr>
             <w:rStyle w:val="Hyperlink"/>
@@ -3169,7 +3169,7 @@
           <w:rPr>
             <w:noProof/>
           </w:rPr>
-          <w:instrText xml:space="preserve"> PAGEREF _Toc241847862 \h </w:instrText>
+          <w:instrText xml:space="preserve"> PAGEREF _Toc241861160 \h </w:instrText>
         </w:r>
         <w:r>
           <w:rPr>
@@ -3208,7 +3208,7 @@
           <w:lang w:val="en-CA"/>
         </w:rPr>
       </w:pPr>
-      <w:hyperlink w:anchor="_Toc241847863" w:history="1">
+      <w:hyperlink w:anchor="_Toc241861161" w:history="1">
         <w:r>
           <w:rPr>
             <w:rStyle w:val="Hyperlink"/>
@@ -3232,7 +3232,7 @@
           <w:rPr>
             <w:noProof/>
           </w:rPr>
-          <w:instrText xml:space="preserve"> PAGEREF _Toc241847863 \h </w:instrText>
+          <w:instrText xml:space="preserve"> PAGEREF _Toc241861161 \h </w:instrText>
         </w:r>
         <w:r>
           <w:rPr>
@@ -3271,7 +3271,7 @@
           <w:lang w:val="en-CA"/>
         </w:rPr>
       </w:pPr>
-      <w:hyperlink w:anchor="_Toc241847864" w:history="1">
+      <w:hyperlink w:anchor="_Toc241861162" w:history="1">
         <w:r>
           <w:rPr>
             <w:rStyle w:val="Hyperlink"/>
@@ -3295,7 +3295,7 @@
           <w:rPr>
             <w:noProof/>
           </w:rPr>
-          <w:instrText xml:space="preserve"> PAGEREF _Toc241847864 \h </w:instrText>
+          <w:instrText xml:space="preserve"> PAGEREF _Toc241861162 \h </w:instrText>
         </w:r>
         <w:r>
           <w:rPr>
@@ -3334,7 +3334,7 @@
           <w:lang w:val="en-CA"/>
         </w:rPr>
       </w:pPr>
-      <w:hyperlink w:anchor="_Toc241847865" w:history="1">
+      <w:hyperlink w:anchor="_Toc241861163" w:history="1">
         <w:r>
           <w:rPr>
             <w:rStyle w:val="Hyperlink"/>
@@ -3358,7 +3358,7 @@
           <w:rPr>
             <w:noProof/>
           </w:rPr>
-          <w:instrText xml:space="preserve"> PAGEREF _Toc241847865 \h </w:instrText>
+          <w:instrText xml:space="preserve"> PAGEREF _Toc241861163 \h </w:instrText>
         </w:r>
         <w:r>
           <w:rPr>
@@ -3397,7 +3397,7 @@
           <w:lang w:val="en-CA"/>
         </w:rPr>
       </w:pPr>
-      <w:hyperlink w:anchor="_Toc241847866" w:history="1">
+      <w:hyperlink w:anchor="_Toc241861164" w:history="1">
         <w:r>
           <w:rPr>
             <w:rStyle w:val="Hyperlink"/>
@@ -3421,7 +3421,7 @@
           <w:rPr>
             <w:noProof/>
           </w:rPr>
-          <w:instrText xml:space="preserve"> PAGEREF _Toc241847866 \h </w:instrText>
+          <w:instrText xml:space="preserve"> PAGEREF _Toc241861164 \h </w:instrText>
         </w:r>
         <w:r>
           <w:rPr>
@@ -3460,7 +3460,7 @@
           <w:lang w:val="en-CA"/>
         </w:rPr>
       </w:pPr>
-      <w:hyperlink w:anchor="_Toc241847867" w:history="1">
+      <w:hyperlink w:anchor="_Toc241861165" w:history="1">
         <w:r>
           <w:rPr>
             <w:rStyle w:val="Hyperlink"/>
@@ -3484,7 +3484,7 @@
           <w:rPr>
             <w:noProof/>
           </w:rPr>
-          <w:instrText xml:space="preserve"> PAGEREF _Toc241847867 \h </w:instrText>
+          <w:instrText xml:space="preserve"> PAGEREF _Toc241861165 \h </w:instrText>
         </w:r>
         <w:r>
           <w:rPr>
@@ -3523,7 +3523,7 @@
           <w:lang w:val="en-CA"/>
         </w:rPr>
       </w:pPr>
-      <w:hyperlink w:anchor="_Toc241847868" w:history="1">
+      <w:hyperlink w:anchor="_Toc241861166" w:history="1">
         <w:r>
           <w:rPr>
             <w:rStyle w:val="Hyperlink"/>
@@ -3547,7 +3547,7 @@
           <w:rPr>
             <w:noProof/>
           </w:rPr>
-          <w:instrText xml:space="preserve"> PAGEREF _Toc241847868 \h </w:instrText>
+          <w:instrText xml:space="preserve"> PAGEREF _Toc241861166 \h </w:instrText>
         </w:r>
         <w:r>
           <w:rPr>
@@ -3586,7 +3586,7 @@
           <w:lang w:val="en-CA"/>
         </w:rPr>
       </w:pPr>
-      <w:hyperlink w:anchor="_Toc241847869" w:history="1">
+      <w:hyperlink w:anchor="_Toc241861167" w:history="1">
         <w:r>
           <w:rPr>
             <w:rStyle w:val="Hyperlink"/>
@@ -3610,7 +3610,7 @@
           <w:rPr>
             <w:noProof/>
           </w:rPr>
-          <w:instrText xml:space="preserve"> PAGEREF _Toc241847869 \h </w:instrText>
+          <w:instrText xml:space="preserve"> PAGEREF _Toc241861167 \h </w:instrText>
         </w:r>
         <w:r>
           <w:rPr>
@@ -3649,7 +3649,7 @@
           <w:lang w:val="en-CA"/>
         </w:rPr>
       </w:pPr>
-      <w:hyperlink w:anchor="_Toc241847870" w:history="1">
+      <w:hyperlink w:anchor="_Toc241861168" w:history="1">
         <w:r>
           <w:rPr>
             <w:rStyle w:val="Hyperlink"/>
@@ -3673,7 +3673,7 @@
           <w:rPr>
             <w:noProof/>
           </w:rPr>
-          <w:instrText xml:space="preserve"> PAGEREF _Toc241847870 \h </w:instrText>
+          <w:instrText xml:space="preserve"> PAGEREF _Toc241861168 \h </w:instrText>
         </w:r>
         <w:r>
           <w:rPr>
@@ -3712,7 +3712,7 @@
           <w:lang w:val="en-CA"/>
         </w:rPr>
       </w:pPr>
-      <w:hyperlink w:anchor="_Toc241847871" w:history="1">
+      <w:hyperlink w:anchor="_Toc241861169" w:history="1">
         <w:r>
           <w:rPr>
             <w:rStyle w:val="Hyperlink"/>
@@ -3736,7 +3736,7 @@
           <w:rPr>
             <w:noProof/>
           </w:rPr>
-          <w:instrText xml:space="preserve"> PAGEREF _Toc241847871 \h </w:instrText>
+          <w:instrText xml:space="preserve"> PAGEREF _Toc241861169 \h </w:instrText>
         </w:r>
         <w:r>
           <w:rPr>
@@ -3775,7 +3775,7 @@
           <w:lang w:val="en-CA"/>
         </w:rPr>
       </w:pPr>
-      <w:hyperlink w:anchor="_Toc241847872" w:history="1">
+      <w:hyperlink w:anchor="_Toc241861170" w:history="1">
         <w:r>
           <w:rPr>
             <w:rStyle w:val="Hyperlink"/>
@@ -3799,7 +3799,7 @@
           <w:rPr>
             <w:noProof/>
           </w:rPr>
-          <w:instrText xml:space="preserve"> PAGEREF _Toc241847872 \h </w:instrText>
+          <w:instrText xml:space="preserve"> PAGEREF _Toc241861170 \h </w:instrText>
         </w:r>
         <w:r>
           <w:rPr>
@@ -3838,7 +3838,7 @@
           <w:lang w:val="en-CA"/>
         </w:rPr>
       </w:pPr>
-      <w:hyperlink w:anchor="_Toc241847873" w:history="1">
+      <w:hyperlink w:anchor="_Toc241861171" w:history="1">
         <w:r>
           <w:rPr>
             <w:rStyle w:val="Hyperlink"/>
@@ -3862,7 +3862,7 @@
           <w:rPr>
             <w:noProof/>
           </w:rPr>
-          <w:instrText xml:space="preserve"> PAGEREF _Toc241847873 \h </w:instrText>
+          <w:instrText xml:space="preserve"> PAGEREF _Toc241861171 \h </w:instrText>
         </w:r>
         <w:r>
           <w:rPr>
@@ -3901,7 +3901,7 @@
           <w:lang w:val="en-CA"/>
         </w:rPr>
       </w:pPr>
-      <w:hyperlink w:anchor="_Toc241847874" w:history="1">
+      <w:hyperlink w:anchor="_Toc241861172" w:history="1">
         <w:r>
           <w:rPr>
             <w:rStyle w:val="Hyperlink"/>
@@ -3925,7 +3925,7 @@
           <w:rPr>
             <w:noProof/>
           </w:rPr>
-          <w:instrText xml:space="preserve"> PAGEREF _Toc241847874 \h </w:instrText>
+          <w:instrText xml:space="preserve"> PAGEREF _Toc241861172 \h </w:instrText>
         </w:r>
         <w:r>
           <w:rPr>
@@ -3971,7 +3971,7 @@
       <w:pPr>
         <w:pStyle w:val="Heading2"/>
       </w:pPr>
-      <w:bookmarkStart w:id="0" w:name="_Toc241847829"/>
+      <w:bookmarkStart w:id="0" w:name="_Toc241861127"/>
       <w:r>
         <w:lastRenderedPageBreak/>
         <w:t>Business Problem and Target Users</w:t>
@@ -3982,7 +3982,7 @@
       <w:pPr>
         <w:pStyle w:val="Heading3"/>
       </w:pPr>
-      <w:bookmarkStart w:id="1" w:name="_Toc241847830"/>
+      <w:bookmarkStart w:id="1" w:name="_Toc241861128"/>
       <w:r>
         <w:t>Business problem solved</w:t>
       </w:r>
@@ -4094,7 +4094,7 @@
       <w:pPr>
         <w:pStyle w:val="Heading3"/>
       </w:pPr>
-      <w:bookmarkStart w:id="2" w:name="_Toc241847831"/>
+      <w:bookmarkStart w:id="2" w:name="_Toc241861129"/>
       <w:r>
         <w:t>Who will use it</w:t>
       </w:r>
@@ -4176,7 +4176,7 @@
       <w:pPr>
         <w:pStyle w:val="Heading3"/>
       </w:pPr>
-      <w:bookmarkStart w:id="3" w:name="_Toc241847832"/>
+      <w:bookmarkStart w:id="3" w:name="_Toc241861130"/>
       <w:r>
         <w:t>A strategic tool, not an operational one</w:t>
       </w:r>
@@ -4300,7 +4300,7 @@
           <w:lang w:eastAsia="en-IN"/>
         </w:rPr>
       </w:pPr>
-      <w:bookmarkStart w:id="4" w:name="_Toc241847833"/>
+      <w:bookmarkStart w:id="4" w:name="_Toc241861131"/>
       <w:r>
         <w:rPr>
           <w:rFonts w:cstheme="minorBidi"/>
@@ -4316,7 +4316,7 @@
           <w:rFonts w:cstheme="minorBidi"/>
         </w:rPr>
       </w:pPr>
-      <w:bookmarkStart w:id="5" w:name="_Toc241847834"/>
+      <w:bookmarkStart w:id="5" w:name="_Toc241861132"/>
       <w:r>
         <w:rPr>
           <w:rFonts w:cstheme="minorBidi"/>
@@ -4519,7 +4519,7 @@
           <w:rFonts w:cstheme="minorBidi"/>
         </w:rPr>
       </w:pPr>
-      <w:bookmarkStart w:id="6" w:name="_Toc241847835"/>
+      <w:bookmarkStart w:id="6" w:name="_Toc241861133"/>
       <w:r>
         <w:rPr>
           <w:rFonts w:cstheme="minorBidi"/>
@@ -4815,7 +4815,7 @@
           <w:rFonts w:cstheme="minorBidi"/>
         </w:rPr>
       </w:pPr>
-      <w:bookmarkStart w:id="7" w:name="_Toc241847836"/>
+      <w:bookmarkStart w:id="7" w:name="_Toc241861134"/>
       <w:r>
         <w:rPr>
           <w:rFonts w:cstheme="minorBidi"/>
@@ -4888,7 +4888,7 @@
           <w:rFonts w:cstheme="minorBidi"/>
         </w:rPr>
       </w:pPr>
-      <w:bookmarkStart w:id="8" w:name="_Toc241847837"/>
+      <w:bookmarkStart w:id="8" w:name="_Toc241861135"/>
       <w:r>
         <w:rPr>
           <w:rFonts w:cstheme="minorBidi"/>
@@ -5017,7 +5017,7 @@
           <w:rFonts w:cstheme="minorBidi"/>
         </w:rPr>
       </w:pPr>
-      <w:bookmarkStart w:id="9" w:name="_Toc241847838"/>
+      <w:bookmarkStart w:id="9" w:name="_Toc241861136"/>
       <w:r>
         <w:rPr>
           <w:rFonts w:cstheme="minorBidi"/>
@@ -5239,7 +5239,7 @@
           <w:rFonts w:cstheme="minorBidi"/>
         </w:rPr>
       </w:pPr>
-      <w:bookmarkStart w:id="10" w:name="_Toc241847839"/>
+      <w:bookmarkStart w:id="10" w:name="_Toc241861137"/>
       <w:r>
         <w:rPr>
           <w:rFonts w:cstheme="minorBidi"/>
@@ -5468,7 +5468,7 @@
           <w:rFonts w:cstheme="minorBidi"/>
         </w:rPr>
       </w:pPr>
-      <w:bookmarkStart w:id="11" w:name="_Toc241847840"/>
+      <w:bookmarkStart w:id="11" w:name="_Toc241861138"/>
       <w:r>
         <w:rPr>
           <w:rFonts w:cstheme="minorBidi"/>
@@ -5669,6 +5669,7 @@
           <w:b/>
           <w:bCs/>
         </w:rPr>
+        <w:lastRenderedPageBreak/>
         <w:t>A pass means:</w:t>
       </w:r>
       <w:r>
@@ -5682,7 +5683,7 @@
           <w:rFonts w:cstheme="minorBidi"/>
         </w:rPr>
       </w:pPr>
-      <w:bookmarkStart w:id="12" w:name="_Toc241847841"/>
+      <w:bookmarkStart w:id="12" w:name="_Toc241861139"/>
       <w:r>
         <w:rPr>
           <w:rFonts w:cstheme="minorBidi"/>
@@ -5857,7 +5858,7 @@
           <w:rFonts w:cstheme="minorBidi"/>
         </w:rPr>
       </w:pPr>
-      <w:bookmarkStart w:id="13" w:name="_Toc241847842"/>
+      <w:bookmarkStart w:id="13" w:name="_Toc241861140"/>
       <w:r>
         <w:rPr>
           <w:rFonts w:cstheme="minorBidi"/>
@@ -5969,11 +5970,12 @@
           <w:rFonts w:cstheme="minorBidi"/>
         </w:rPr>
       </w:pPr>
-      <w:bookmarkStart w:id="14" w:name="_Toc241847843"/>
+      <w:bookmarkStart w:id="14" w:name="_Toc241861141"/>
       <w:r>
         <w:rPr>
           <w:rFonts w:cstheme="minorBidi"/>
         </w:rPr>
+        <w:lastRenderedPageBreak/>
         <w:t xml:space="preserve">Switching </w:t>
       </w:r>
       <w:r>
@@ -6023,7 +6025,7 @@
           <w:rFonts w:cstheme="minorBidi"/>
         </w:rPr>
       </w:pPr>
-      <w:bookmarkStart w:id="15" w:name="_Toc241847844"/>
+      <w:bookmarkStart w:id="15" w:name="_Toc241861142"/>
       <w:r>
         <w:rPr>
           <w:rFonts w:cstheme="minorBidi"/>
@@ -6068,7 +6070,7 @@
           <w:lang w:eastAsia="en-IN"/>
         </w:rPr>
       </w:pPr>
-      <w:bookmarkStart w:id="16" w:name="_Toc241847845"/>
+      <w:bookmarkStart w:id="16" w:name="_Toc241861143"/>
       <w:r>
         <w:rPr>
           <w:rFonts w:cstheme="minorBidi"/>
@@ -6084,7 +6086,7 @@
           <w:rFonts w:cstheme="minorBidi"/>
         </w:rPr>
       </w:pPr>
-      <w:bookmarkStart w:id="17" w:name="_Toc241847846"/>
+      <w:bookmarkStart w:id="17" w:name="_Toc241861144"/>
       <w:r>
         <w:rPr>
           <w:rFonts w:cstheme="minorBidi"/>
@@ -6109,7 +6111,7 @@
           <w:rFonts w:cstheme="minorBidi"/>
         </w:rPr>
       </w:pPr>
-      <w:bookmarkStart w:id="18" w:name="_Toc241847847"/>
+      <w:bookmarkStart w:id="18" w:name="_Toc241861145"/>
       <w:r>
         <w:rPr>
           <w:rFonts w:cstheme="minorBidi"/>
@@ -6221,7 +6223,7 @@
           <w:rFonts w:cstheme="minorBidi"/>
         </w:rPr>
       </w:pPr>
-      <w:bookmarkStart w:id="19" w:name="_Toc241847848"/>
+      <w:bookmarkStart w:id="19" w:name="_Toc241861146"/>
       <w:r>
         <w:rPr>
           <w:rFonts w:cstheme="minorBidi"/>
@@ -6392,7 +6394,11 @@
           </w:tcPr>
           <w:p>
             <w:r>
-              <w:t>Oracle E-Business Suite on Oracle Exadata Database Service on Oracle Database@Azure; custom schema MCP_VIEWS</w:t>
+              <w:t xml:space="preserve">Oracle E-Business Suite on Oracle Exadata Database Service on Oracle </w:t>
+            </w:r>
+            <w:r>
+              <w:lastRenderedPageBreak/>
+              <w:t>Database@Azure; custom schema MCP_VIEWS</w:t>
             </w:r>
           </w:p>
         </w:tc>
@@ -6410,7 +6416,12 @@
           </w:tcPr>
           <w:p>
             <w:r>
-              <w:t>System of record for demand and the warehouse network. Also stores the location data and candidate sites the agents add</w:t>
+              <w:lastRenderedPageBreak/>
+              <w:t xml:space="preserve">System of record for demand and the warehouse network. Also stores the location data </w:t>
+            </w:r>
+            <w:r>
+              <w:lastRenderedPageBreak/>
+              <w:t>and candidate sites the agents add</w:t>
             </w:r>
           </w:p>
         </w:tc>
@@ -6444,6 +6455,7 @@
                 <w:b/>
                 <w:bCs/>
               </w:rPr>
+              <w:lastRenderedPageBreak/>
               <w:t>Access</w:t>
             </w:r>
           </w:p>
@@ -6848,7 +6860,7 @@
           <w:rFonts w:cstheme="minorBidi"/>
         </w:rPr>
       </w:pPr>
-      <w:bookmarkStart w:id="20" w:name="_Toc241847849"/>
+      <w:bookmarkStart w:id="20" w:name="_Toc241861147"/>
       <w:r>
         <w:rPr>
           <w:rFonts w:cstheme="minorBidi"/>
@@ -6967,6 +6979,7 @@
           <w:b/>
           <w:bCs/>
         </w:rPr>
+        <w:lastRenderedPageBreak/>
         <w:t>Least-privilege access:</w:t>
       </w:r>
       <w:r>
@@ -6980,7 +6993,7 @@
           <w:rFonts w:cstheme="minorBidi"/>
         </w:rPr>
       </w:pPr>
-      <w:bookmarkStart w:id="21" w:name="_Toc241847850"/>
+      <w:bookmarkStart w:id="21" w:name="_Toc241861148"/>
       <w:r>
         <w:rPr>
           <w:rFonts w:cstheme="minorBidi"/>
@@ -7273,7 +7286,7 @@
           <w:rFonts w:cstheme="minorBidi"/>
         </w:rPr>
       </w:pPr>
-      <w:bookmarkStart w:id="22" w:name="_Toc241847851"/>
+      <w:bookmarkStart w:id="22" w:name="_Toc241861149"/>
       <w:r>
         <w:rPr>
           <w:rFonts w:cstheme="minorBidi"/>
@@ -7318,6 +7331,7 @@
           <w:b/>
           <w:bCs/>
         </w:rPr>
+        <w:lastRenderedPageBreak/>
         <w:t>Coverage:</w:t>
       </w:r>
       <w:r>
@@ -7395,7 +7409,7 @@
           <w:rFonts w:cstheme="minorBidi"/>
         </w:rPr>
       </w:pPr>
-      <w:bookmarkStart w:id="23" w:name="_Toc241847852"/>
+      <w:bookmarkStart w:id="23" w:name="_Toc241861150"/>
       <w:r>
         <w:rPr>
           <w:rFonts w:cstheme="minorBidi"/>
@@ -7784,7 +7798,7 @@
           <w:rFonts w:cstheme="minorBidi"/>
         </w:rPr>
       </w:pPr>
-      <w:bookmarkStart w:id="24" w:name="_Toc241847853"/>
+      <w:bookmarkStart w:id="24" w:name="_Toc241861151"/>
       <w:r>
         <w:rPr>
           <w:rFonts w:cstheme="minorBidi"/>
@@ -7823,6 +7837,7 @@
           <w:b/>
           <w:bCs/>
         </w:rPr>
+        <w:lastRenderedPageBreak/>
         <w:t>It is repeatable and auditable.</w:t>
       </w:r>
       <w:r>
@@ -7907,7 +7922,7 @@
           <w:lang w:eastAsia="en-IN"/>
         </w:rPr>
       </w:pPr>
-      <w:bookmarkStart w:id="25" w:name="_Toc241847854"/>
+      <w:bookmarkStart w:id="25" w:name="_Toc241861152"/>
       <w:r>
         <w:rPr>
           <w:rFonts w:cstheme="minorBidi"/>
@@ -7975,7 +7990,7 @@
           <w:rFonts w:cstheme="minorBidi"/>
         </w:rPr>
       </w:pPr>
-      <w:bookmarkStart w:id="26" w:name="_Toc241847855"/>
+      <w:bookmarkStart w:id="26" w:name="_Toc241861153"/>
       <w:r>
         <w:rPr>
           <w:rFonts w:cstheme="minorBidi"/>
@@ -8228,6 +8243,7 @@
           </w:tcPr>
           <w:p>
             <w:r>
+              <w:lastRenderedPageBreak/>
               <w:t>4</w:t>
             </w:r>
           </w:p>
@@ -8506,7 +8522,7 @@
           <w:rFonts w:cstheme="minorBidi"/>
         </w:rPr>
       </w:pPr>
-      <w:bookmarkStart w:id="27" w:name="_Toc241847856"/>
+      <w:bookmarkStart w:id="27" w:name="_Toc241861154"/>
       <w:r>
         <w:rPr>
           <w:rFonts w:cstheme="minorBidi"/>
@@ -8523,7 +8539,7 @@
           <w:rFonts w:cstheme="minorBidi"/>
         </w:rPr>
       </w:pPr>
-      <w:bookmarkStart w:id="28" w:name="_Toc241847857"/>
+      <w:bookmarkStart w:id="28" w:name="_Toc241861155"/>
       <w:r>
         <w:rPr>
           <w:rFonts w:cstheme="minorBidi"/>
@@ -8732,6 +8748,7 @@
         <w:rPr>
           <w:b/>
         </w:rPr>
+        <w:lastRenderedPageBreak/>
         <w:t>Market research:</w:t>
       </w:r>
       <w:r>
@@ -10033,6 +10050,7 @@
                 <w:b/>
                 <w:bCs/>
               </w:rPr>
+              <w:lastRenderedPageBreak/>
               <w:t>Limitation</w:t>
             </w:r>
           </w:p>
@@ -10388,8 +10406,9 @@
       <w:pPr>
         <w:pStyle w:val="Heading2"/>
       </w:pPr>
-      <w:bookmarkStart w:id="29" w:name="_Toc241847858"/>
-      <w:r>
+      <w:bookmarkStart w:id="29" w:name="_Toc241861156"/>
+      <w:r>
+        <w:lastRenderedPageBreak/>
         <w:t>Oracle AI Database@Azure, Oracle MCP and Microsoft IQ</w:t>
       </w:r>
       <w:bookmarkEnd w:id="29"/>
@@ -10949,7 +10968,7 @@
           </w:tcPr>
           <w:p>
             <w:r>
-              <w:t>Web IQ rejected the Foundry managed identity (limited access). Foundry web search used instead</w:t>
+              <w:t>Web IQ rejected the Foundry managed identity: the tenant is not enrolled in the Frontier Preview Program. Foundry web search used instead</w:t>
             </w:r>
           </w:p>
         </w:tc>
@@ -11063,6 +11082,7 @@
               </w:rPr>
             </w:pPr>
             <w:r>
+              <w:lastRenderedPageBreak/>
               <w:t>Foundry IQ</w:t>
             </w:r>
           </w:p>
@@ -11211,7 +11231,7 @@
       <w:pPr>
         <w:pStyle w:val="Heading3"/>
       </w:pPr>
-      <w:bookmarkStart w:id="30" w:name="_Toc241847859"/>
+      <w:bookmarkStart w:id="30" w:name="_Toc241861157"/>
       <w:r>
         <w:t>Web IQ: what we tried</w:t>
       </w:r>
@@ -11219,14 +11239,14 @@
     </w:p>
     <w:p>
       <w:r>
-        <w:t>We wanted Tier 2 market research to run on Microsoft Web IQ instead of the generic web search tool, because it returns structured results with source URLs that suit cited research. We configured Web IQ as an OpenAPI tool in Foundry using the Foundry account's managed identity, the same keyless pattern we use for Azure Maps. Web IQ accepted the token but rejected the identity: "Application ... is not authorized to access this service". Web IQ is currently limited access, and our tenant is not enrolled, so we could not add it before the deadline and kept Foundry web search. The tool definition is ready in the repository (tools/webiq/) and can be switched on once access is granted.</w:t>
+        <w:t>We wanted Tier 2 market research to run on Microsoft Web IQ instead of the generic web search tool, because it returns structured results with source URLs that suit cited research. We configured Web IQ as an OpenAPI tool in Foundry using the Foundry account's managed identity, the same keyless pattern we use for Azure Maps. Web IQ accepted the token but rejected the identity: "Application ... is not authorized to access this service". Web IQ access requires tenant enrollment in the Microsoft Frontier Preview Program, and our tenant is not enrolled, so we could not add it before the deadline and kept Foundry web search. The tool definition is ready in the repository (tools/webiq/) and can be switched on once access is granted.</w:t>
       </w:r>
     </w:p>
     <w:p>
       <w:pPr>
         <w:pStyle w:val="Heading3"/>
       </w:pPr>
-      <w:bookmarkStart w:id="31" w:name="_Toc241847860"/>
+      <w:bookmarkStart w:id="31" w:name="_Toc241861158"/>
       <w:r>
         <w:t>Why we did not force Fabric IQ and Foundry IQ into this build</w:t>
       </w:r>
@@ -11246,8 +11266,9 @@
       <w:pPr>
         <w:pStyle w:val="Heading2"/>
       </w:pPr>
-      <w:bookmarkStart w:id="32" w:name="_Toc241847861"/>
-      <w:r>
+      <w:bookmarkStart w:id="32" w:name="_Toc241861159"/>
+      <w:r>
+        <w:lastRenderedPageBreak/>
         <w:t>Project Evolution and Key Design Decisions</w:t>
       </w:r>
       <w:bookmarkEnd w:id="32"/>
@@ -11261,7 +11282,7 @@
       <w:pPr>
         <w:pStyle w:val="Heading3"/>
       </w:pPr>
-      <w:bookmarkStart w:id="33" w:name="_Toc241847862"/>
+      <w:bookmarkStart w:id="33" w:name="_Toc241861160"/>
       <w:r>
         <w:t>Timeline</w:t>
       </w:r>
@@ -11548,7 +11569,7 @@
           </w:tcPr>
           <w:p>
             <w:r>
-              <w:t>Hackathon Learn &amp; Earn period, including the Oracle MCP session on 17 Sep. [TEAM INPUT REQUIRED]</w:t>
+              <w:t>Hackathon Learn &amp; Earn period, including the Oracle MCP session on 17 Sep.</w:t>
             </w:r>
           </w:p>
         </w:tc>
@@ -11564,7 +11585,11 @@
             <w:vAlign w:val="center"/>
             <w:hideMark/>
           </w:tcPr>
-          <w:p/>
+          <w:p>
+            <w:r>
+              <w:t>Oracle MCP approach confirmed for the build.</w:t>
+            </w:r>
+          </w:p>
         </w:tc>
       </w:tr>
       <w:tr>
@@ -11808,7 +11833,11 @@
           </w:tcPr>
           <w:p>
             <w:r>
-              <w:t>End-to-end run on Vision Operations 2002-2010: FINAL ranking at 99.9% geocoded. Web IQ attempted for research and blocked by access. Solution packaged as code.</w:t>
+              <w:t xml:space="preserve">End-to-end run on Vision Operations 2002-2010: FINAL ranking at 99.9% geocoded. Web IQ attempted for research </w:t>
+            </w:r>
+            <w:r>
+              <w:lastRenderedPageBreak/>
+              <w:t>and blocked by access. Solution packaged as code.</w:t>
             </w:r>
           </w:p>
         </w:tc>
@@ -11826,6 +11855,7 @@
           </w:tcPr>
           <w:p>
             <w:r>
+              <w:lastRenderedPageBreak/>
               <w:t>The test evidence in this document.</w:t>
             </w:r>
           </w:p>
@@ -11836,7 +11866,7 @@
       <w:pPr>
         <w:pStyle w:val="Heading3"/>
       </w:pPr>
-      <w:bookmarkStart w:id="34" w:name="_Toc241847863"/>
+      <w:bookmarkStart w:id="34" w:name="_Toc241861161"/>
       <w:r>
         <w:t>Decisions that shaped the design</w:t>
       </w:r>
@@ -12644,7 +12674,11 @@
           </w:tcPr>
           <w:p>
             <w:r>
-              <w:t>Has to be set through the agent API; the portal offers only connection auth</w:t>
+              <w:t xml:space="preserve">Has to be set through the agent API; the portal </w:t>
+            </w:r>
+            <w:r>
+              <w:lastRenderedPageBreak/>
+              <w:t>offers only connection auth</w:t>
             </w:r>
           </w:p>
         </w:tc>
@@ -12654,8 +12688,9 @@
       <w:pPr>
         <w:pStyle w:val="Heading3"/>
       </w:pPr>
-      <w:bookmarkStart w:id="35" w:name="_Toc241847864"/>
-      <w:r>
+      <w:bookmarkStart w:id="35" w:name="_Toc241861162"/>
+      <w:r>
+        <w:lastRenderedPageBreak/>
         <w:t>Lessons learned</w:t>
       </w:r>
       <w:bookmarkEnd w:id="35"/>
@@ -12788,8 +12823,9 @@
       <w:pPr>
         <w:pStyle w:val="Heading2"/>
       </w:pPr>
-      <w:bookmarkStart w:id="36" w:name="_Toc241847865"/>
-      <w:r>
+      <w:bookmarkStart w:id="36" w:name="_Toc241861163"/>
+      <w:r>
+        <w:lastRenderedPageBreak/>
         <w:t>Business Value and Expected ROI</w:t>
       </w:r>
       <w:bookmarkEnd w:id="36"/>
@@ -12803,7 +12839,7 @@
       <w:pPr>
         <w:pStyle w:val="Heading3"/>
       </w:pPr>
-      <w:bookmarkStart w:id="37" w:name="_Toc241847866"/>
+      <w:bookmarkStart w:id="37" w:name="_Toc241861164"/>
       <w:r>
         <w:t>Why the decision matters</w:t>
       </w:r>
@@ -12818,7 +12854,7 @@
       <w:pPr>
         <w:pStyle w:val="Heading3"/>
       </w:pPr>
-      <w:bookmarkStart w:id="38" w:name="_Toc241847867"/>
+      <w:bookmarkStart w:id="38" w:name="_Toc241861165"/>
       <w:r>
         <w:t>Expected benefits</w:t>
       </w:r>
@@ -13503,15 +13539,16 @@
       <w:pPr>
         <w:pStyle w:val="Heading3"/>
       </w:pPr>
-      <w:bookmarkStart w:id="39" w:name="_Toc241847868"/>
-      <w:r>
+      <w:bookmarkStart w:id="39" w:name="_Toc241861166"/>
+      <w:r>
+        <w:lastRenderedPageBreak/>
         <w:t>How we would size ROI with a client</w:t>
       </w:r>
       <w:bookmarkEnd w:id="39"/>
     </w:p>
     <w:p>
       <w:r>
-        <w:t>Annual value = studies per year x analyst hours saved per study x loaded hourly rate, plus the avoided cost of a poorer site choice agreed with finance. Cost = Foundry and model consumption + MCP hosting + support effort. [TEAM INPUT REQUIRED]: number of siting studies a typical client runs per year and current hours per study.</w:t>
+        <w:t>Annual value = studies per year x analyst hours saved per study x loaded hourly rate, plus the avoided cost of a poorer site choice agreed with finance. Cost = Foundry and model consumption + MCP hosting + support effort. These inputs have not yet been measured with a business sponsor.</w:t>
       </w:r>
     </w:p>
     <w:p>
@@ -13523,8 +13560,9 @@
       <w:pPr>
         <w:pStyle w:val="Heading2"/>
       </w:pPr>
-      <w:bookmarkStart w:id="40" w:name="_Toc241847869"/>
-      <w:r>
+      <w:bookmarkStart w:id="40" w:name="_Toc241861167"/>
+      <w:r>
+        <w:lastRenderedPageBreak/>
         <w:t>Production Readiness Assessment</w:t>
       </w:r>
       <w:bookmarkEnd w:id="40"/>
@@ -13980,15 +14018,16 @@
       <w:pPr>
         <w:pStyle w:val="Heading2"/>
       </w:pPr>
-      <w:bookmarkStart w:id="41" w:name="_Toc241847870"/>
-      <w:r>
+      <w:bookmarkStart w:id="41" w:name="_Toc241861168"/>
+      <w:r>
+        <w:lastRenderedPageBreak/>
         <w:t>Microsoft Marketplace Readiness Assessment</w:t>
       </w:r>
       <w:bookmarkEnd w:id="41"/>
     </w:p>
     <w:p>
       <w:r>
-        <w:t>A Marketplace offer is not part of this submission. [TEAM INPUT REQUIRED]: confirm whether Marketplace publication is planned and, if so, the intended offer type.</w:t>
+        <w:t>Marketplace publication is not planned at this stage, and no offer type has been chosen. The table shows what productising would take.</w:t>
       </w:r>
     </w:p>
     <w:tbl>
@@ -14437,8 +14476,9 @@
       <w:pPr>
         <w:pStyle w:val="Heading2"/>
       </w:pPr>
-      <w:bookmarkStart w:id="42" w:name="_Toc241847871"/>
-      <w:r>
+      <w:bookmarkStart w:id="42" w:name="_Toc241861169"/>
+      <w:r>
+        <w:lastRenderedPageBreak/>
         <w:t>Bonus Innovation Highlights</w:t>
       </w:r>
       <w:bookmarkEnd w:id="42"/>
@@ -14945,68 +14985,6 @@
           </w:p>
         </w:tc>
       </w:tr>
-      <w:tr>
-        <w:trPr>
-          <w:tblCellSpacing w:w="15" w:type="dxa"/>
-        </w:trPr>
-        <w:tc>
-          <w:tcPr>
-            <w:tcW w:w="2650" w:type="dxa"/>
-            <w:tcBorders>
-              <w:top w:val="single" w:sz="6" w:space="0" w:color="E6E6E6"/>
-              <w:left w:val="single" w:sz="6" w:space="0" w:color="E6E6E6"/>
-              <w:bottom w:val="single" w:sz="6" w:space="0" w:color="E6E6E6"/>
-              <w:right w:val="single" w:sz="6" w:space="0" w:color="E6E6E6"/>
-            </w:tcBorders>
-            <w:shd w:val="clear" w:color="auto" w:fill="F5F5F5"/>
-            <w:vAlign w:val="center"/>
-            <w:hideMark/>
-          </w:tcPr>
-          <w:p>
-            <w:pPr>
-              <w:rPr>
-                <w:b/>
-                <w:bCs/>
-              </w:rPr>
-            </w:pPr>
-            <w:r>
-              <w:t>Review of existing AI Blueprints</w:t>
-            </w:r>
-          </w:p>
-        </w:tc>
-        <w:tc>
-          <w:tcPr>
-            <w:tcW w:w="4637" w:type="dxa"/>
-            <w:tcBorders>
-              <w:top w:val="single" w:sz="6" w:space="0" w:color="E6E6E6"/>
-              <w:left w:val="single" w:sz="6" w:space="0" w:color="E6E6E6"/>
-              <w:bottom w:val="single" w:sz="6" w:space="0" w:color="E6E6E6"/>
-              <w:right w:val="single" w:sz="6" w:space="0" w:color="E6E6E6"/>
-            </w:tcBorders>
-            <w:vAlign w:val="center"/>
-            <w:hideMark/>
-          </w:tcPr>
-          <w:p>
-            <w:r>
-              <w:t>[TEAM INPUT REQUIRED]</w:t>
-            </w:r>
-          </w:p>
-        </w:tc>
-        <w:tc>
-          <w:tcPr>
-            <w:tcW w:w="1722" w:type="dxa"/>
-            <w:tcBorders>
-              <w:top w:val="single" w:sz="6" w:space="0" w:color="E6E6E6"/>
-              <w:left w:val="single" w:sz="6" w:space="0" w:color="E6E6E6"/>
-              <w:bottom w:val="single" w:sz="6" w:space="0" w:color="E6E6E6"/>
-              <w:right w:val="single" w:sz="6" w:space="0" w:color="E6E6E6"/>
-            </w:tcBorders>
-            <w:vAlign w:val="center"/>
-            <w:hideMark/>
-          </w:tcPr>
-          <w:p/>
-        </w:tc>
-      </w:tr>
     </w:tbl>
     <w:p>
       <w:r>
@@ -15017,8 +14995,9 @@
       <w:pPr>
         <w:pStyle w:val="Heading2"/>
       </w:pPr>
-      <w:bookmarkStart w:id="43" w:name="_Toc241847872"/>
-      <w:r>
+      <w:bookmarkStart w:id="43" w:name="_Toc241861170"/>
+      <w:r>
+        <w:lastRenderedPageBreak/>
         <w:t>Demo Script for Judges</w:t>
       </w:r>
       <w:bookmarkEnd w:id="43"/>
@@ -15601,7 +15580,7 @@
       <w:pPr>
         <w:pStyle w:val="Heading3"/>
       </w:pPr>
-      <w:bookmarkStart w:id="44" w:name="_Toc241847873"/>
+      <w:bookmarkStart w:id="44" w:name="_Toc241861171"/>
       <w:r>
         <w:t>Prompts used in the demo</w:t>
       </w:r>
@@ -15652,6 +15631,7 @@
         <w:rPr>
           <w:b/>
         </w:rPr>
+        <w:lastRenderedPageBreak/>
         <w:t>Recommendation Agent:</w:t>
       </w:r>
       <w:r>
@@ -15667,15 +15647,16 @@
       <w:pPr>
         <w:pStyle w:val="Heading2"/>
       </w:pPr>
-      <w:bookmarkStart w:id="45" w:name="_Toc241847874"/>
-      <w:r>
+      <w:bookmarkStart w:id="45" w:name="_Toc241861172"/>
+      <w:r>
+        <w:lastRenderedPageBreak/>
         <w:t>Contribution summary and acknowledgements</w:t>
       </w:r>
       <w:bookmarkEnd w:id="45"/>
     </w:p>
     <w:p>
       <w:r>
-        <w:t>Designed and developed by the Accenture team. [TEAM INPUT REQUIRED]: team members and roles.</w:t>
+        <w:t>Designed and developed by the Accenture team: Simo Vilmunen, Mayuresh Kolhatkar, Marc Gero and Vikrant Deshmukh.</w:t>
       </w:r>
     </w:p>
     <w:p/>

</xml_diff>